<commit_message>
feat: enhance Projects component with improved layout and new project details, including Kaspenu and Firebase icons
</commit_message>
<xml_diff>
--- a/public/doc/Resume - Avner.docx
+++ b/public/doc/Resume - Avner.docx
@@ -17,29 +17,19 @@
           <w:lang w:val="en-GB"/>
         </w:rPr>
       </w:pPr>
-      <w:r>
-        <w:fldChar w:fldCharType="begin"/>
-      </w:r>
-      <w:r>
-        <w:instrText>HYPERLINK "https://avneradda.github.io/"</w:instrText>
-      </w:r>
-      <w:r>
-        <w:fldChar w:fldCharType="separate"/>
-      </w:r>
-      <w:r>
-        <w:rPr>
-          <w:rStyle w:val="Hyperlink"/>
-          <w:rFonts w:ascii="Twentieth Century" w:eastAsia="Twentieth Century" w:hAnsi="Twentieth Century" w:cs="Twentieth Century"/>
-          <w:b/>
-          <w:sz w:val="26"/>
-          <w:szCs w:val="26"/>
-          <w:lang w:val="en-GB"/>
-        </w:rPr>
-        <w:t>Avner Adda</w:t>
-      </w:r>
-      <w:r>
-        <w:fldChar w:fldCharType="end"/>
-      </w:r>
+      <w:hyperlink r:id="rId7" w:history="1">
+        <w:r>
+          <w:rPr>
+            <w:rStyle w:val="Hyperlink"/>
+            <w:rFonts w:ascii="Twentieth Century" w:eastAsia="Twentieth Century" w:hAnsi="Twentieth Century" w:cs="Twentieth Century"/>
+            <w:b/>
+            <w:sz w:val="26"/>
+            <w:szCs w:val="26"/>
+            <w:lang w:val="en-GB"/>
+          </w:rPr>
+          <w:t>Avner Adda</w:t>
+        </w:r>
+      </w:hyperlink>
     </w:p>
     <w:p>
       <w:pPr>
@@ -143,7 +133,7 @@
         </w:rPr>
         <w:t xml:space="preserve"> </w:t>
       </w:r>
-      <w:hyperlink r:id="rId7" w:history="1">
+      <w:hyperlink r:id="rId8" w:history="1">
         <w:r>
           <w:rPr>
             <w:rStyle w:val="Hyperlink"/>
@@ -228,8 +218,7 @@
         </w:rPr>
         <w:t xml:space="preserve">GitHub: </w:t>
       </w:r>
-      <w:hyperlink r:id="rId8">
-        <w:proofErr w:type="spellStart"/>
+      <w:hyperlink r:id="rId9">
         <w:r>
           <w:rPr>
             <w:rFonts w:ascii="Twentieth Century" w:eastAsia="Twentieth Century" w:hAnsi="Twentieth Century" w:cs="Twentieth Century"/>
@@ -241,7 +230,6 @@
           </w:rPr>
           <w:t>AvnerAdda</w:t>
         </w:r>
-        <w:proofErr w:type="spellEnd"/>
       </w:hyperlink>
     </w:p>
     <w:p>
@@ -306,7 +294,25 @@
           <w:szCs w:val="21"/>
           <w:lang w:val="en-GB"/>
         </w:rPr>
-        <w:t>Currently at Deloitte, I work on implementing innovative AI solutions across various industries, from Life Sciences to Banking. I'm particularly passionate about Natural Language Processing and building scalable AI systems. My expertise spans across AWS and GCP cloud platforms, where I hold professional certifications in Machine Learning and Data Science.</w:t>
+        <w:t xml:space="preserve">Currently at Deloitte, I work on implementing innovative AI solutions across various industries, from Life Sciences to Banking. I'm particularly passionate about </w:t>
+      </w:r>
+      <w:r>
+        <w:rPr>
+          <w:rFonts w:ascii="Twentieth Century" w:eastAsia="Twentieth Century" w:hAnsi="Twentieth Century" w:cs="Twentieth Century"/>
+          <w:sz w:val="21"/>
+          <w:szCs w:val="21"/>
+          <w:lang w:val="en-GB"/>
+        </w:rPr>
+        <w:t xml:space="preserve">LLMs, </w:t>
+      </w:r>
+      <w:r>
+        <w:rPr>
+          <w:rFonts w:ascii="Twentieth Century" w:eastAsia="Twentieth Century" w:hAnsi="Twentieth Century" w:cs="Twentieth Century"/>
+          <w:sz w:val="21"/>
+          <w:szCs w:val="21"/>
+          <w:lang w:val="en-GB"/>
+        </w:rPr>
+        <w:t>Natural Language Processing and building scalable AI systems. My expertise spans across AWS and GCP cloud platforms, where I hold professional certifications in Machine Learning and Data Science.</w:t>
       </w:r>
       <w:r>
         <w:rPr>
@@ -576,110 +582,28 @@
           <w:szCs w:val="21"/>
           <w:lang w:val="en-GB"/>
         </w:rPr>
-        <w:t>Implement</w:t>
-      </w:r>
-      <w:r>
-        <w:rPr>
-          <w:rFonts w:ascii="Twentieth Century" w:eastAsia="Twentieth Century" w:hAnsi="Twentieth Century" w:cs="Twentieth Century"/>
-          <w:i/>
-          <w:iCs/>
-          <w:sz w:val="21"/>
-          <w:szCs w:val="21"/>
-          <w:lang w:val="en-GB"/>
-        </w:rPr>
-        <w:t>ed</w:t>
-      </w:r>
-      <w:r>
-        <w:rPr>
-          <w:rFonts w:ascii="Twentieth Century" w:eastAsia="Twentieth Century" w:hAnsi="Twentieth Century" w:cs="Twentieth Century"/>
-          <w:i/>
-          <w:iCs/>
-          <w:sz w:val="21"/>
-          <w:szCs w:val="21"/>
-          <w:lang w:val="en-GB"/>
-        </w:rPr>
-        <w:t xml:space="preserve"> a data cleansing solution </w:t>
-      </w:r>
-      <w:r>
-        <w:rPr>
-          <w:rFonts w:ascii="Twentieth Century" w:eastAsia="Twentieth Century" w:hAnsi="Twentieth Century" w:cs="Twentieth Century"/>
-          <w:i/>
-          <w:iCs/>
-          <w:sz w:val="21"/>
-          <w:szCs w:val="21"/>
-          <w:lang w:val="en-GB"/>
-        </w:rPr>
-        <w:t xml:space="preserve">to mask sensitive information </w:t>
-      </w:r>
-      <w:r>
-        <w:rPr>
-          <w:rFonts w:ascii="Twentieth Century" w:eastAsia="Twentieth Century" w:hAnsi="Twentieth Century" w:cs="Twentieth Century"/>
-          <w:i/>
-          <w:iCs/>
-          <w:sz w:val="21"/>
-          <w:szCs w:val="21"/>
-          <w:lang w:val="en-GB"/>
-        </w:rPr>
-        <w:t xml:space="preserve">on documents </w:t>
-      </w:r>
-      <w:r>
-        <w:rPr>
-          <w:rFonts w:ascii="Twentieth Century" w:eastAsia="Twentieth Century" w:hAnsi="Twentieth Century" w:cs="Twentieth Century"/>
-          <w:i/>
-          <w:iCs/>
-          <w:sz w:val="21"/>
-          <w:szCs w:val="21"/>
-          <w:lang w:val="en-GB"/>
-        </w:rPr>
-        <w:t xml:space="preserve">using </w:t>
-      </w:r>
-      <w:r>
-        <w:rPr>
-          <w:rFonts w:ascii="Twentieth Century" w:eastAsia="Twentieth Century" w:hAnsi="Twentieth Century" w:cs="Twentieth Century"/>
-          <w:b/>
-          <w:bCs/>
-          <w:i/>
-          <w:iCs/>
-          <w:sz w:val="21"/>
-          <w:szCs w:val="21"/>
-          <w:lang w:val="en-GB"/>
-        </w:rPr>
-        <w:t xml:space="preserve">NLP </w:t>
-      </w:r>
-      <w:r>
-        <w:rPr>
-          <w:rFonts w:ascii="Twentieth Century" w:eastAsia="Twentieth Century" w:hAnsi="Twentieth Century" w:cs="Twentieth Century"/>
-          <w:b/>
-          <w:bCs/>
-          <w:i/>
-          <w:iCs/>
-          <w:sz w:val="21"/>
-          <w:szCs w:val="21"/>
-          <w:lang w:val="en-GB"/>
-        </w:rPr>
-        <w:t>method</w:t>
-      </w:r>
-      <w:r>
-        <w:rPr>
-          <w:rFonts w:ascii="Twentieth Century" w:eastAsia="Twentieth Century" w:hAnsi="Twentieth Century" w:cs="Twentieth Century"/>
-          <w:i/>
-          <w:iCs/>
-          <w:sz w:val="21"/>
-          <w:szCs w:val="21"/>
-          <w:lang w:val="en-GB"/>
-        </w:rPr>
-        <w:t xml:space="preserve"> (NER)</w:t>
-      </w:r>
-      <w:r>
-        <w:rPr>
-          <w:rFonts w:ascii="Twentieth Century" w:eastAsia="Twentieth Century" w:hAnsi="Twentieth Century" w:cs="Twentieth Century"/>
-          <w:i/>
-          <w:iCs/>
-          <w:sz w:val="21"/>
-          <w:szCs w:val="21"/>
-          <w:lang w:val="en-GB"/>
-        </w:rPr>
-        <w:t xml:space="preserve">. </w:t>
+        <w:t>Develop a GenAI product that automated</w:t>
+      </w:r>
+      <w:r>
+        <w:rPr>
+          <w:rFonts w:ascii="Twentieth Century" w:eastAsia="Twentieth Century" w:hAnsi="Twentieth Century" w:cs="Twentieth Century"/>
+          <w:i/>
+          <w:iCs/>
+          <w:sz w:val="21"/>
+          <w:szCs w:val="21"/>
+        </w:rPr>
+        <w:t xml:space="preserve"> consulting tasks using agentic tools and LLM graph flow. </w:t>
+      </w:r>
+      <w:r>
+        <w:rPr>
+          <w:rFonts w:ascii="Twentieth Century" w:eastAsia="Twentieth Century" w:hAnsi="Twentieth Century" w:cs="Twentieth Century"/>
+          <w:i/>
+          <w:iCs/>
+          <w:sz w:val="21"/>
+          <w:szCs w:val="21"/>
+          <w:lang w:val="en-GB"/>
+        </w:rPr>
+        <w:t xml:space="preserve"> </w:t>
       </w:r>
     </w:p>
     <w:p>
@@ -730,38 +654,112 @@
           <w:iCs/>
           <w:sz w:val="21"/>
           <w:szCs w:val="21"/>
-        </w:rPr>
-        <w:t xml:space="preserve">Architected and implemented an enterprise-scale </w:t>
-      </w:r>
-      <w:r>
-        <w:rPr>
-          <w:rFonts w:ascii="Twentieth Century" w:eastAsia="Twentieth Century" w:hAnsi="Twentieth Century" w:cs="Twentieth Century"/>
-          <w:i/>
-          <w:iCs/>
-          <w:sz w:val="21"/>
-          <w:szCs w:val="21"/>
-        </w:rPr>
-        <w:t>Graph-</w:t>
-      </w:r>
-      <w:r>
-        <w:rPr>
-          <w:rFonts w:ascii="Twentieth Century" w:eastAsia="Twentieth Century" w:hAnsi="Twentieth Century" w:cs="Twentieth Century"/>
-          <w:i/>
-          <w:iCs/>
-          <w:sz w:val="21"/>
-          <w:szCs w:val="21"/>
-        </w:rPr>
-        <w:t>RAG system for healthcare data processing</w:t>
-      </w:r>
-      <w:r>
-        <w:rPr>
-          <w:rFonts w:ascii="Twentieth Century" w:eastAsia="Twentieth Century" w:hAnsi="Twentieth Century" w:cs="Twentieth Century"/>
-          <w:i/>
-          <w:iCs/>
-          <w:sz w:val="21"/>
-          <w:szCs w:val="21"/>
-        </w:rPr>
-        <w:t>.</w:t>
+          <w:lang w:val="en-GB"/>
+        </w:rPr>
+        <w:t>Implement</w:t>
+      </w:r>
+      <w:r>
+        <w:rPr>
+          <w:rFonts w:ascii="Twentieth Century" w:eastAsia="Twentieth Century" w:hAnsi="Twentieth Century" w:cs="Twentieth Century"/>
+          <w:i/>
+          <w:iCs/>
+          <w:sz w:val="21"/>
+          <w:szCs w:val="21"/>
+          <w:lang w:val="en-GB"/>
+        </w:rPr>
+        <w:t>ed</w:t>
+      </w:r>
+      <w:r>
+        <w:rPr>
+          <w:rFonts w:ascii="Twentieth Century" w:eastAsia="Twentieth Century" w:hAnsi="Twentieth Century" w:cs="Twentieth Century"/>
+          <w:i/>
+          <w:iCs/>
+          <w:sz w:val="21"/>
+          <w:szCs w:val="21"/>
+          <w:lang w:val="en-GB"/>
+        </w:rPr>
+        <w:t xml:space="preserve"> a data cleansing solution </w:t>
+      </w:r>
+      <w:r>
+        <w:rPr>
+          <w:rFonts w:ascii="Twentieth Century" w:eastAsia="Twentieth Century" w:hAnsi="Twentieth Century" w:cs="Twentieth Century"/>
+          <w:i/>
+          <w:iCs/>
+          <w:sz w:val="21"/>
+          <w:szCs w:val="21"/>
+          <w:lang w:val="en-GB"/>
+        </w:rPr>
+        <w:t xml:space="preserve">to mask sensitive information </w:t>
+      </w:r>
+      <w:r>
+        <w:rPr>
+          <w:rFonts w:ascii="Twentieth Century" w:eastAsia="Twentieth Century" w:hAnsi="Twentieth Century" w:cs="Twentieth Century"/>
+          <w:i/>
+          <w:iCs/>
+          <w:sz w:val="21"/>
+          <w:szCs w:val="21"/>
+          <w:lang w:val="en-GB"/>
+        </w:rPr>
+        <w:t xml:space="preserve">on documents </w:t>
+      </w:r>
+      <w:r>
+        <w:rPr>
+          <w:rFonts w:ascii="Twentieth Century" w:eastAsia="Twentieth Century" w:hAnsi="Twentieth Century" w:cs="Twentieth Century"/>
+          <w:i/>
+          <w:iCs/>
+          <w:sz w:val="21"/>
+          <w:szCs w:val="21"/>
+          <w:lang w:val="en-GB"/>
+        </w:rPr>
+        <w:t xml:space="preserve">using </w:t>
+      </w:r>
+      <w:r>
+        <w:rPr>
+          <w:rFonts w:ascii="Twentieth Century" w:eastAsia="Twentieth Century" w:hAnsi="Twentieth Century" w:cs="Twentieth Century"/>
+          <w:b/>
+          <w:bCs/>
+          <w:i/>
+          <w:iCs/>
+          <w:sz w:val="21"/>
+          <w:szCs w:val="21"/>
+          <w:lang w:val="en-GB"/>
+        </w:rPr>
+        <w:t xml:space="preserve">NLP </w:t>
+      </w:r>
+      <w:r>
+        <w:rPr>
+          <w:rFonts w:ascii="Twentieth Century" w:eastAsia="Twentieth Century" w:hAnsi="Twentieth Century" w:cs="Twentieth Century"/>
+          <w:b/>
+          <w:bCs/>
+          <w:i/>
+          <w:iCs/>
+          <w:sz w:val="21"/>
+          <w:szCs w:val="21"/>
+          <w:lang w:val="en-GB"/>
+        </w:rPr>
+        <w:t>method</w:t>
+      </w:r>
+      <w:r>
+        <w:rPr>
+          <w:rFonts w:ascii="Twentieth Century" w:eastAsia="Twentieth Century" w:hAnsi="Twentieth Century" w:cs="Twentieth Century"/>
+          <w:i/>
+          <w:iCs/>
+          <w:sz w:val="21"/>
+          <w:szCs w:val="21"/>
+          <w:lang w:val="en-GB"/>
+        </w:rPr>
+        <w:t xml:space="preserve"> (NER)</w:t>
+      </w:r>
+      <w:r>
+        <w:rPr>
+          <w:rFonts w:ascii="Twentieth Century" w:eastAsia="Twentieth Century" w:hAnsi="Twentieth Century" w:cs="Twentieth Century"/>
+          <w:i/>
+          <w:iCs/>
+          <w:sz w:val="21"/>
+          <w:szCs w:val="21"/>
+          <w:lang w:val="en-GB"/>
+        </w:rPr>
+        <w:t xml:space="preserve">. </w:t>
       </w:r>
     </w:p>
     <w:p>
@@ -813,7 +811,37 @@
           <w:sz w:val="21"/>
           <w:szCs w:val="21"/>
         </w:rPr>
-        <w:t>Led end-to-end development of a machine learning clustering algorithm for healthcare provider segmentation, processing 1M+ patient records to optimize drug accessibility pathways</w:t>
+        <w:t xml:space="preserve">Architected and implemented an enterprise-scale </w:t>
+      </w:r>
+      <w:r>
+        <w:rPr>
+          <w:rFonts w:ascii="Twentieth Century" w:eastAsia="Twentieth Century" w:hAnsi="Twentieth Century" w:cs="Twentieth Century"/>
+          <w:i/>
+          <w:iCs/>
+          <w:sz w:val="21"/>
+          <w:szCs w:val="21"/>
+        </w:rPr>
+        <w:t>Graph-</w:t>
+      </w:r>
+      <w:r>
+        <w:rPr>
+          <w:rFonts w:ascii="Twentieth Century" w:eastAsia="Twentieth Century" w:hAnsi="Twentieth Century" w:cs="Twentieth Century"/>
+          <w:i/>
+          <w:iCs/>
+          <w:sz w:val="21"/>
+          <w:szCs w:val="21"/>
+        </w:rPr>
+        <w:t>RAG system for healthcare data processing</w:t>
+      </w:r>
+      <w:r>
+        <w:rPr>
+          <w:rFonts w:ascii="Twentieth Century" w:eastAsia="Twentieth Century" w:hAnsi="Twentieth Century" w:cs="Twentieth Century"/>
+          <w:i/>
+          <w:iCs/>
+          <w:sz w:val="21"/>
+          <w:szCs w:val="21"/>
+        </w:rPr>
+        <w:t>.</w:t>
       </w:r>
     </w:p>
     <w:p>
@@ -865,6 +893,58 @@
           <w:sz w:val="21"/>
           <w:szCs w:val="21"/>
         </w:rPr>
+        <w:t>Led end-to-end development of a machine learning clustering algorithm for healthcare provider segmentation, processing 1M+ patient records to optimize drug accessibility pathways</w:t>
+      </w:r>
+    </w:p>
+    <w:p>
+      <w:pPr>
+        <w:numPr>
+          <w:ilvl w:val="0"/>
+          <w:numId w:val="1"/>
+        </w:numPr>
+        <w:pBdr>
+          <w:top w:val="nil"/>
+          <w:left w:val="nil"/>
+          <w:bottom w:val="nil"/>
+          <w:right w:val="nil"/>
+          <w:between w:val="nil"/>
+        </w:pBdr>
+        <w:tabs>
+          <w:tab w:val="left" w:pos="916"/>
+          <w:tab w:val="left" w:pos="1832"/>
+          <w:tab w:val="left" w:pos="2748"/>
+          <w:tab w:val="left" w:pos="3664"/>
+          <w:tab w:val="left" w:pos="4580"/>
+          <w:tab w:val="left" w:pos="5496"/>
+          <w:tab w:val="left" w:pos="6412"/>
+          <w:tab w:val="left" w:pos="7328"/>
+          <w:tab w:val="left" w:pos="8244"/>
+          <w:tab w:val="left" w:pos="9160"/>
+          <w:tab w:val="left" w:pos="10076"/>
+          <w:tab w:val="left" w:pos="10992"/>
+          <w:tab w:val="left" w:pos="11908"/>
+          <w:tab w:val="left" w:pos="12824"/>
+          <w:tab w:val="left" w:pos="13740"/>
+          <w:tab w:val="left" w:pos="14656"/>
+        </w:tabs>
+        <w:jc w:val="both"/>
+        <w:rPr>
+          <w:rFonts w:ascii="Twentieth Century" w:eastAsia="Twentieth Century" w:hAnsi="Twentieth Century" w:cs="Twentieth Century"/>
+          <w:i/>
+          <w:iCs/>
+          <w:sz w:val="21"/>
+          <w:szCs w:val="21"/>
+          <w:lang w:val="en-GB"/>
+        </w:rPr>
+      </w:pPr>
+      <w:r>
+        <w:rPr>
+          <w:rFonts w:ascii="Twentieth Century" w:eastAsia="Twentieth Century" w:hAnsi="Twentieth Century" w:cs="Twentieth Century"/>
+          <w:i/>
+          <w:iCs/>
+          <w:sz w:val="21"/>
+          <w:szCs w:val="21"/>
+        </w:rPr>
         <w:t>Collaborated with diverse consumer goods clients to deliver personalized customer clustering analyses using classical Machine Learning and Generative AI techniques. Additionally, contributed to the development and improvement of the package</w:t>
       </w:r>
     </w:p>
@@ -925,7 +1005,7 @@
         </w:rPr>
         <w:t xml:space="preserve">: Python, </w:t>
       </w:r>
-      <w:hyperlink r:id="rId9" w:history="1">
+      <w:hyperlink r:id="rId10" w:history="1">
         <w:r>
           <w:rPr>
             <w:rStyle w:val="Hyperlink"/>
@@ -946,7 +1026,7 @@
         </w:rPr>
         <w:t xml:space="preserve">, </w:t>
       </w:r>
-      <w:hyperlink r:id="rId10" w:history="1">
+      <w:hyperlink r:id="rId11" w:history="1">
         <w:r>
           <w:rPr>
             <w:rStyle w:val="Hyperlink"/>
@@ -1010,19 +1090,8 @@
           <w:szCs w:val="21"/>
           <w:lang w:val="en-GB"/>
         </w:rPr>
-        <w:t xml:space="preserve">Tableau, </w:t>
-      </w:r>
-      <w:proofErr w:type="spellStart"/>
-      <w:r>
-        <w:rPr>
-          <w:rFonts w:ascii="Twentieth Century" w:eastAsia="Twentieth Century" w:hAnsi="Twentieth Century" w:cs="Twentieth Century"/>
-          <w:sz w:val="21"/>
-          <w:szCs w:val="21"/>
-          <w:lang w:val="en-GB"/>
-        </w:rPr>
-        <w:t>PowerBI</w:t>
-      </w:r>
-      <w:proofErr w:type="spellEnd"/>
+        <w:t>Tableau, PowerBI</w:t>
+      </w:r>
       <w:r>
         <w:rPr>
           <w:rFonts w:ascii="Twentieth Century" w:eastAsia="Twentieth Century" w:hAnsi="Twentieth Century" w:cs="Twentieth Century"/>
@@ -1032,7 +1101,7 @@
         </w:rPr>
         <w:t xml:space="preserve">, Dataiku, </w:t>
       </w:r>
-      <w:hyperlink r:id="rId11" w:history="1">
+      <w:hyperlink r:id="rId12" w:history="1">
         <w:r>
           <w:rPr>
             <w:rStyle w:val="Hyperlink"/>
@@ -1411,25 +1480,14 @@
         </w:rPr>
         <w:t xml:space="preserve">, MySQL, </w:t>
       </w:r>
-      <w:proofErr w:type="spellStart"/>
-      <w:r>
-        <w:rPr>
-          <w:rFonts w:ascii="Twentieth Century" w:eastAsia="Twentieth Century" w:hAnsi="Twentieth Century" w:cs="Twentieth Century"/>
-          <w:sz w:val="21"/>
-          <w:szCs w:val="21"/>
-          <w:lang w:val="en-GB"/>
-        </w:rPr>
-        <w:t>ElasticSearch</w:t>
-      </w:r>
-      <w:proofErr w:type="spellEnd"/>
-      <w:r>
-        <w:rPr>
-          <w:rFonts w:ascii="Twentieth Century" w:eastAsia="Twentieth Century" w:hAnsi="Twentieth Century" w:cs="Twentieth Century"/>
-          <w:sz w:val="21"/>
-          <w:szCs w:val="21"/>
-          <w:lang w:val="en-GB"/>
-        </w:rPr>
-        <w:t xml:space="preserve">, </w:t>
+      <w:r>
+        <w:rPr>
+          <w:rFonts w:ascii="Twentieth Century" w:eastAsia="Twentieth Century" w:hAnsi="Twentieth Century" w:cs="Twentieth Century"/>
+          <w:sz w:val="21"/>
+          <w:szCs w:val="21"/>
+          <w:lang w:val="en-GB"/>
+        </w:rPr>
+        <w:t xml:space="preserve">ElasticSearch, </w:t>
       </w:r>
       <w:r>
         <w:rPr>
@@ -1886,7 +1944,6 @@
         </w:rPr>
         <w:t xml:space="preserve"> ESILV, </w:t>
       </w:r>
-      <w:proofErr w:type="gramStart"/>
       <w:r>
         <w:rPr>
           <w:rFonts w:ascii="Twentieth Century" w:eastAsia="Twentieth Century" w:hAnsi="Twentieth Century" w:cs="Twentieth Century"/>
@@ -1907,7 +1964,6 @@
         </w:rPr>
         <w:t>aster’s Degree</w:t>
       </w:r>
-      <w:proofErr w:type="gramEnd"/>
       <w:r>
         <w:rPr>
           <w:rFonts w:ascii="Twentieth Century" w:eastAsia="Twentieth Century" w:hAnsi="Twentieth Century" w:cs="Twentieth Century"/>
@@ -2107,29 +2163,7 @@
           <w:szCs w:val="21"/>
           <w:lang w:val="en-GB"/>
         </w:rPr>
-        <w:t xml:space="preserve">PyCharm, </w:t>
-      </w:r>
-      <w:proofErr w:type="spellStart"/>
-      <w:r>
-        <w:rPr>
-          <w:rFonts w:ascii="Twentieth Century" w:eastAsia="Twentieth Century" w:hAnsi="Twentieth Century" w:cs="Twentieth Century"/>
-          <w:bCs/>
-          <w:sz w:val="21"/>
-          <w:szCs w:val="21"/>
-          <w:lang w:val="en-GB"/>
-        </w:rPr>
-        <w:t>Jupyter</w:t>
-      </w:r>
-      <w:proofErr w:type="spellEnd"/>
-      <w:r>
-        <w:rPr>
-          <w:rFonts w:ascii="Twentieth Century" w:eastAsia="Twentieth Century" w:hAnsi="Twentieth Century" w:cs="Twentieth Century"/>
-          <w:bCs/>
-          <w:sz w:val="21"/>
-          <w:szCs w:val="21"/>
-          <w:lang w:val="en-GB"/>
-        </w:rPr>
-        <w:t>, V</w:t>
+        <w:t>PyCharm, Jupyter, V</w:t>
       </w:r>
       <w:r>
         <w:rPr>
@@ -2521,6 +2555,66 @@
         </w:rPr>
         <w:t xml:space="preserve">: </w:t>
       </w:r>
+      <w:hyperlink r:id="rId13" w:history="1">
+        <w:r>
+          <w:rPr>
+            <w:rStyle w:val="Hyperlink"/>
+            <w:rFonts w:ascii="Twentieth Century" w:eastAsia="Twentieth Century" w:hAnsi="Twentieth Century" w:cs="Twentieth Century"/>
+            <w:sz w:val="21"/>
+            <w:szCs w:val="21"/>
+            <w:lang w:val="en-GB"/>
+          </w:rPr>
+          <w:t>Language Platform</w:t>
+        </w:r>
+      </w:hyperlink>
+      <w:r>
+        <w:rPr>
+          <w:rFonts w:ascii="Twentieth Century" w:eastAsia="Twentieth Century" w:hAnsi="Twentieth Century" w:cs="Twentieth Century"/>
+          <w:sz w:val="21"/>
+          <w:szCs w:val="21"/>
+          <w:lang w:val="en-GB"/>
+        </w:rPr>
+        <w:t xml:space="preserve"> and </w:t>
+      </w:r>
+      <w:hyperlink r:id="rId14" w:history="1">
+        <w:r>
+          <w:rPr>
+            <w:rStyle w:val="Hyperlink"/>
+            <w:rFonts w:ascii="Twentieth Century" w:eastAsia="Twentieth Century" w:hAnsi="Twentieth Century" w:cs="Twentieth Century"/>
+            <w:sz w:val="21"/>
+            <w:szCs w:val="21"/>
+            <w:lang w:val="en-GB"/>
+          </w:rPr>
+          <w:t>gamified company training</w:t>
+        </w:r>
+      </w:hyperlink>
+      <w:r>
+        <w:rPr>
+          <w:rFonts w:ascii="Twentieth Century" w:eastAsia="Twentieth Century" w:hAnsi="Twentieth Century" w:cs="Twentieth Century"/>
+          <w:sz w:val="21"/>
+          <w:szCs w:val="21"/>
+          <w:lang w:val="en-GB"/>
+        </w:rPr>
+        <w:t xml:space="preserve"> using AI</w:t>
+      </w:r>
+      <w:r>
+        <w:rPr>
+          <w:rFonts w:ascii="Twentieth Century" w:eastAsia="Twentieth Century" w:hAnsi="Twentieth Century" w:cs="Twentieth Century"/>
+          <w:sz w:val="21"/>
+          <w:szCs w:val="21"/>
+          <w:lang w:val="en-GB"/>
+        </w:rPr>
+        <w:t xml:space="preserve"> and Vibe Coding</w:t>
+      </w:r>
+      <w:r>
+        <w:rPr>
+          <w:rFonts w:ascii="Twentieth Century" w:eastAsia="Twentieth Century" w:hAnsi="Twentieth Century" w:cs="Twentieth Century"/>
+          <w:sz w:val="21"/>
+          <w:szCs w:val="21"/>
+          <w:lang w:val="en-GB"/>
+        </w:rPr>
+        <w:t xml:space="preserve">, </w:t>
+      </w:r>
       <w:r>
         <w:rPr>
           <w:rFonts w:ascii="Twentieth Century" w:eastAsia="Twentieth Century" w:hAnsi="Twentieth Century" w:cs="Twentieth Century"/>
@@ -2537,27 +2631,7 @@
           <w:szCs w:val="21"/>
           <w:lang w:val="en-GB"/>
         </w:rPr>
-        <w:t xml:space="preserve">(Deep Learning, CNN, </w:t>
-      </w:r>
-      <w:proofErr w:type="spellStart"/>
-      <w:r>
-        <w:rPr>
-          <w:rFonts w:ascii="Twentieth Century" w:eastAsia="Twentieth Century" w:hAnsi="Twentieth Century" w:cs="Twentieth Century"/>
-          <w:sz w:val="21"/>
-          <w:szCs w:val="21"/>
-          <w:lang w:val="en-GB"/>
-        </w:rPr>
-        <w:t>XGBoost</w:t>
-      </w:r>
-      <w:proofErr w:type="spellEnd"/>
-      <w:r>
-        <w:rPr>
-          <w:rFonts w:ascii="Twentieth Century" w:eastAsia="Twentieth Century" w:hAnsi="Twentieth Century" w:cs="Twentieth Century"/>
-          <w:sz w:val="21"/>
-          <w:szCs w:val="21"/>
-          <w:lang w:val="en-GB"/>
-        </w:rPr>
-        <w:t>)</w:t>
+        <w:t>(Deep Learning, CNN, XGBoost)</w:t>
       </w:r>
       <w:r>
         <w:rPr>
@@ -2640,25 +2714,14 @@
         </w:rPr>
         <w:t xml:space="preserve"> (</w:t>
       </w:r>
-      <w:proofErr w:type="spellStart"/>
-      <w:r>
-        <w:rPr>
-          <w:rFonts w:ascii="Twentieth Century" w:eastAsia="Twentieth Century" w:hAnsi="Twentieth Century" w:cs="Twentieth Century"/>
-          <w:sz w:val="21"/>
-          <w:szCs w:val="21"/>
-          <w:lang w:val="en-GB"/>
-        </w:rPr>
-        <w:t>Kaspenu</w:t>
-      </w:r>
-      <w:proofErr w:type="spellEnd"/>
-      <w:r>
-        <w:rPr>
-          <w:rFonts w:ascii="Twentieth Century" w:eastAsia="Twentieth Century" w:hAnsi="Twentieth Century" w:cs="Twentieth Century"/>
-          <w:sz w:val="21"/>
-          <w:szCs w:val="21"/>
-          <w:lang w:val="en-GB"/>
-        </w:rPr>
-        <w:t xml:space="preserve"> - </w:t>
+      <w:r>
+        <w:rPr>
+          <w:rFonts w:ascii="Twentieth Century" w:eastAsia="Twentieth Century" w:hAnsi="Twentieth Century" w:cs="Twentieth Century"/>
+          <w:sz w:val="21"/>
+          <w:szCs w:val="21"/>
+          <w:lang w:val="en-GB"/>
+        </w:rPr>
+        <w:t xml:space="preserve">Kaspenu - </w:t>
       </w:r>
       <w:r>
         <w:rPr>
@@ -2776,8 +2839,8 @@
       </w:r>
     </w:p>
     <w:sectPr>
-      <w:headerReference w:type="default" r:id="rId12"/>
-      <w:footerReference w:type="even" r:id="rId13"/>
+      <w:headerReference w:type="default" r:id="rId15"/>
+      <w:footerReference w:type="even" r:id="rId16"/>
       <w:pgSz w:w="12240" w:h="15840"/>
       <w:pgMar w:top="964" w:right="992" w:bottom="567" w:left="1134" w:header="0" w:footer="720" w:gutter="0"/>
       <w:pgNumType w:start="1"/>
@@ -3546,6 +3609,7 @@
   <w:style w:type="character" w:default="1" w:styleId="DefaultParagraphFont">
     <w:name w:val="Default Paragraph Font"/>
     <w:uiPriority w:val="1"/>
+    <w:semiHidden/>
     <w:unhideWhenUsed/>
   </w:style>
   <w:style w:type="table" w:default="1" w:styleId="TableNormal">

</xml_diff>